<commit_message>
PRISME lot 3 : parcours EDB terminé (440/478 appariées), 16 n° ICUR absents de la liste publique, chiffres mis à jour
Co-Authored-By: Claude Opus 5.5 <noreply@anthropic.com>
Claude-Session: https://claude.ai/code/session_018MA1py41WVmv44hMs7iE7u
</commit_message>
<xml_diff>
--- a/06_livrables/PRISME_cahier_revision_v3_lot1.docx
+++ b/06_livrables/PRISME_cahier_revision_v3_lot1.docx
@@ -49,7 +49,7 @@
         <w:t xml:space="preserve"> </w:t>
       </w:r>
       <w:r>
-        <w:t xml:space="preserve">1-2)</w:t>
+        <w:t xml:space="preserve">1-3)</w:t>
       </w:r>
     </w:p>
     <w:p>
@@ -5715,23 +5715,23 @@
           <w:bCs/>
           <w:b/>
         </w:rPr>
-        <w:t xml:space="preserve">435 notices appariées</w:t>
-      </w:r>
-      <w:r>
-        <w:t xml:space="preserve"> </w:t>
-      </w:r>
-      <w:r>
-        <w:t xml:space="preserve">(lot 2), l’EDB décrit pour</w:t>
-      </w:r>
-      <w:r>
-        <w:t xml:space="preserve"> </w:t>
-      </w:r>
-      <w:r>
-        <w:rPr>
-          <w:bCs/>
-          <w:b/>
-        </w:rPr>
-        <w:t xml:space="preserve">45 d’entre elles un chrisme ou une croix</w:t>
+        <w:t xml:space="preserve">440 notices appariées</w:t>
+      </w:r>
+      <w:r>
+        <w:t xml:space="preserve"> </w:t>
+      </w:r>
+      <w:r>
+        <w:t xml:space="preserve">(lot 3), l’EDB décrit pour</w:t>
+      </w:r>
+      <w:r>
+        <w:t xml:space="preserve"> </w:t>
+      </w:r>
+      <w:r>
+        <w:rPr>
+          <w:bCs/>
+          <w:b/>
+        </w:rPr>
+        <w:t xml:space="preserve">46 d’entre elles un chrisme ou une croix</w:t>
       </w:r>
       <w:r>
         <w:t xml:space="preserve"> </w:t>
@@ -5802,7 +5802,7 @@
         <w:t xml:space="preserve">crux gammata</w:t>
       </w:r>
       <w:r>
-        <w:t xml:space="preserve">, etc. Ce sont les n° 4, 16, 22, 24, 34, 38, 43, 46, 49, 50, 55, 60, 68, 73, 94, 99, 100, 109, 118, 128, 136, 139, 142, 143, 146, 147, 179, 183, 193, 209, 213, 247, 273, 275, 276, 321, 344, 357, 376, 400, 402, 430, 431, 434 et 465. Le n° 339 porte un monogramme de nom (</w:t>
+        <w:t xml:space="preserve">, etc. Ce sont les n° 4, 16, 22, 24, 34, 38, 43, 46, 49, 50, 55, 60, 68, 73, 94, 99, 100, 109, 118, 128, 136, 139, 142, 143, 146, 147, 179, 183, 193, 209, 213, 247, 260, 273, 275, 276, 321, 344, 357, 376, 400, 402, 430, 431, 434 et 465. Le n° 339 porte un monogramme de nom (</w:t>
       </w:r>
       <w:r>
         <w:rPr>
@@ -5869,7 +5869,7 @@
           <w:bCs/>
           <w:b/>
         </w:rPr>
-        <w:t xml:space="preserve">45 notices sur 435 collationnées (10,3 %)</w:t>
+        <w:t xml:space="preserve">46 notices sur 440 collationnées (10,5 %)</w:t>
       </w:r>
       <w:r>
         <w:t xml:space="preserve"> </w:t>
@@ -5995,7 +5995,7 @@
           <w:iCs/>
           <w:i/>
         </w:rPr>
-        <w:t xml:space="preserve">Section nouvelle, à insérer après le § 5.3 de la v2.0. Les chiffres sont ceux du lot 2 (435 notices appariées sur 478) et seront mis à jour à la fin de la collation.</w:t>
+        <w:t xml:space="preserve">Section nouvelle, à insérer après le § 5.3 de la v2.0. Les chiffres sont ceux du lot 3 (440 notices appariées sur 478) et seront mis à jour à la fin de la collation.</w:t>
       </w:r>
     </w:p>
     <w:bookmarkStart w:id="43" w:name="pourquoi-une-seconde-base"/>
@@ -6086,7 +6086,7 @@
         <w:pStyle w:val="BodyText"/>
       </w:pPr>
       <w:r>
-        <w:t xml:space="preserve">À la date de cette version, 435 notices sur 478 ont été appariées. 265 concordent, aux conventions de notation près ; 133 présentent des écarts à examiner ; 37 divergent fortement, le plus souvent parce que l’un des deux textes est tronqué.</w:t>
+        <w:t xml:space="preserve">À la date de cette version, 440 notices sur 478 ont été appariées. 269 concordent, aux conventions de notation près ; 134 présentent des écarts à examiner ; 37 divergent fortement, le plus souvent parce que l’un des deux textes est tronqué.</w:t>
       </w:r>
     </w:p>
     <w:bookmarkEnd w:id="44"/>
@@ -6170,7 +6170,7 @@
         <w:t xml:space="preserve"> </w:t>
       </w:r>
       <w:r>
-        <w:t xml:space="preserve">L’EDB décrit chrismes, croix, oiseaux, palmes et orants. L’EDCS ne les mentionne pas. Sur les 435 notices appariées, 45 (10,3 %) portent un chrisme ou une croix selon l’EDB. Dans un cas (n° 38), l’EDCS rend le chrisme par un mot développé,</w:t>
+        <w:t xml:space="preserve">L’EDB décrit chrismes, croix, oiseaux, palmes et orants. L’EDCS ne les mentionne pas. Sur les 440 notices appariées, 46 (10,5 %) portent un chrisme ou une croix selon l’EDB. Dans un cas (n° 38), l’EDCS rend le chrisme par un mot développé,</w:t>
       </w:r>
       <w:r>
         <w:t xml:space="preserve"> </w:t>
@@ -6425,13 +6425,13 @@
     </w:p>
     <w:bookmarkEnd w:id="46"/>
     <w:bookmarkEnd w:id="47"/>
-    <w:bookmarkStart w:id="52" w:name="Xf0bcecbb11b2383e59493386ddb0bea164d860a"/>
+    <w:bookmarkStart w:id="52" w:name="X27d27ef2cf4e64d4923f945d401386ea3627118"/>
     <w:p>
       <w:pPr>
         <w:pStyle w:val="Heading1"/>
       </w:pPr>
       <w:r>
-        <w:t xml:space="preserve">État de la collation EDCS / EDB (au 14 octobre 2026, lot 2)</w:t>
+        <w:t xml:space="preserve">État de la collation EDCS / EDB (au 14 octobre 2026, lot 3 : parcours des listes terminé)</w:t>
       </w:r>
     </w:p>
     <w:bookmarkStart w:id="48" w:name="méthode"/>
@@ -6703,7 +6703,7 @@
     <w:tbl>
       <w:tblPr>
         <w:tblStyle w:val="Table"/>
-        <w:tblW w:type="pct" w:w="5000"/>
+        <w:tblW w:type="auto" w:w="0"/>
         <w:tblLook w:firstRow="1" w:lastRow="0" w:firstColumn="0" w:lastColumn="0" w:noHBand="0" w:noVBand="0" w:val="0020"/>
         <w:jc w:val="start"/>
       </w:tblPr>
@@ -6761,7 +6761,7 @@
               <w:jc w:val="left"/>
             </w:pPr>
             <w:r>
-              <w:t xml:space="preserve">265</w:t>
+              <w:t xml:space="preserve">269</w:t>
             </w:r>
           </w:p>
         </w:tc>
@@ -6787,7 +6787,7 @@
               <w:jc w:val="left"/>
             </w:pPr>
             <w:r>
-              <w:t xml:space="preserve">133</w:t>
+              <w:t xml:space="preserve">134</w:t>
             </w:r>
           </w:p>
         </w:tc>
@@ -6847,7 +6847,7 @@
                 <w:bCs/>
                 <w:b/>
               </w:rPr>
-              <w:t xml:space="preserve">435</w:t>
+              <w:t xml:space="preserve">440</w:t>
             </w:r>
           </w:p>
         </w:tc>
@@ -6861,19 +6861,19 @@
               <w:jc w:val="left"/>
             </w:pPr>
             <w:r>
-              <w:t xml:space="preserve">page EDB non encore consultée (dont les 16 numéros absents ci-dessous)</w:t>
-            </w:r>
-          </w:p>
-        </w:tc>
-        <w:tc>
-          <w:tcPr/>
-          <w:p>
-            <w:pPr>
-              <w:pStyle w:val="Compact"/>
-              <w:jc w:val="left"/>
-            </w:pPr>
-            <w:r>
-              <w:t xml:space="preserve">21</w:t>
+              <w:t xml:space="preserve">numéro ICUR absent de la liste publique EDB (voir ci-dessous)</w:t>
+            </w:r>
+          </w:p>
+        </w:tc>
+        <w:tc>
+          <w:tcPr/>
+          <w:p>
+            <w:pPr>
+              <w:pStyle w:val="Compact"/>
+              <w:jc w:val="left"/>
+            </w:pPr>
+            <w:r>
+              <w:t xml:space="preserve">16</w:t>
             </w:r>
           </w:p>
         </w:tc>
@@ -6910,17 +6910,33 @@
         <w:pStyle w:val="BodyText"/>
       </w:pPr>
       <w:r>
-        <w:t xml:space="preserve">16 numéros ICUR se trouvent dans des plages déjà parcourues sans y figurer sous ce numéro : 4798, 4799, 4800, 4802, 4804, 4805, 4807, 4808, 4815, 4829, 4830, 4832, 4836, 4948, 5711 et 5712. La liste EDB saute par exemple de 4781 à 4900. Ces textes sont peut-être enregistrés dans l’EDB sous une autre référence, ou n’y sont pas.</w:t>
-      </w:r>
-      <w:r>
-        <w:t xml:space="preserve"> </w:t>
-      </w:r>
-      <w:r>
-        <w:rPr>
-          <w:bCs/>
-          <w:b/>
-        </w:rPr>
-        <w:t xml:space="preserve">À rechercher par texte ou par bibliographie.</w:t>
+        <w:t xml:space="preserve">16 numéros ICUR se trouvent dans des plages déjà parcourues sans y figurer sous ce numéro : 4798, 4799, 4800, 4802, 4804, 4805, 4807, 4808, 4815, 4829, 4830, 4832, 4836, 4948, 5711 et 5712. La liste EDB saute par exemple de 4781 à 4900. Une recherche par texte (n° 202,</w:t>
+      </w:r>
+      <w:r>
+        <w:t xml:space="preserve"> </w:t>
+      </w:r>
+      <w:r>
+        <w:rPr>
+          <w:iCs/>
+          <w:i/>
+        </w:rPr>
+        <w:t xml:space="preserve">Cinnamius Opas lector tituli Fasciolae</w:t>
+      </w:r>
+      <w:r>
+        <w:t xml:space="preserve">) n’a rien donné. L’EDB indique dans son bandeau que certaines fiches ne sont pas publiques (« only selected records are publicly available online on the Vatican Museums website »). Il est possible que ces numéros, attribués à la basilique Saint-Paul dans la v2.0, en fassent partie : c’est une</w:t>
+      </w:r>
+      <w:r>
+        <w:t xml:space="preserve"> </w:t>
+      </w:r>
+      <w:r>
+        <w:rPr>
+          <w:bCs/>
+          <w:b/>
+        </w:rPr>
+        <w:t xml:space="preserve">hypothèse non vérifiée</w:t>
+      </w:r>
+      <w:r>
+        <w:t xml:space="preserve">. Les notices concernées sont les n° 12, 13, 25, 26, 45, 65, 116, 117, 149, 161, 202, 212, 374, 406, 407 et 452.</w:t>
       </w:r>
     </w:p>
     <w:bookmarkEnd w:id="49"/>
@@ -7255,7 +7271,7 @@
         <w:t xml:space="preserve"> </w:t>
       </w:r>
       <w:r>
-        <w:t xml:space="preserve">Poursuivre la lecture paginée (une dizaine de pages restantes pour les volumes V–X, plus les fiches détaillées pour les textes tronqués « More »).</w:t>
+        <w:t xml:space="preserve">Les listes ont été entièrement parcourues pour les numéros ICUR du corpus. Reste à ouvrir les fiches détaillées pour les textes tronqués « More »).</w:t>
       </w:r>
     </w:p>
     <w:p>
@@ -7295,13 +7311,13 @@
     </w:p>
     <w:bookmarkEnd w:id="51"/>
     <w:bookmarkEnd w:id="52"/>
-    <w:bookmarkStart w:id="54" w:name="X9bd6f138e759cb7279910c87f5dda5fc2a8849d"/>
+    <w:bookmarkStart w:id="54" w:name="Xcd263894440e5b9c2996aaf14dcc1cca657d31e"/>
     <w:p>
       <w:pPr>
         <w:pStyle w:val="Heading1"/>
       </w:pPr>
       <w:r>
-        <w:t xml:space="preserve">Statistiques recalculées sur les lectures stabilisées (lot 2)</w:t>
+        <w:t xml:space="preserve">Statistiques recalculées sur les lectures stabilisées (lot 3)</w:t>
       </w:r>
     </w:p>
     <w:p>
@@ -7550,7 +7566,7 @@
                 <w:bCs/>
                 <w:b/>
               </w:rPr>
-              <w:t xml:space="preserve">265</w:t>
+              <w:t xml:space="preserve">269</w:t>
             </w:r>
           </w:p>
         </w:tc>
@@ -7588,19 +7604,19 @@
               <w:jc w:val="left"/>
             </w:pPr>
             <w:r>
-              <w:t xml:space="preserve">340s : 15 ; 350s : 10 ; 360s : 46 ; 370s : 48 ; 380s : 66 ; 390s : 59 ; 400–403 : 21</w:t>
-            </w:r>
-          </w:p>
-        </w:tc>
-        <w:tc>
-          <w:tcPr/>
-          <w:p>
-            <w:pPr>
-              <w:pStyle w:val="Compact"/>
-              <w:jc w:val="left"/>
-            </w:pPr>
-            <w:r>
-              <w:t xml:space="preserve">265</w:t>
+              <w:t xml:space="preserve">340s : 16 ; 350s : 10 ; 360s : 46 ; 370s : 48 ; 380s : 68 ; 390s : 59 ; 400–403 : 22</w:t>
+            </w:r>
+          </w:p>
+        </w:tc>
+        <w:tc>
+          <w:tcPr/>
+          <w:p>
+            <w:pPr>
+              <w:pStyle w:val="Compact"/>
+              <w:jc w:val="left"/>
+            </w:pPr>
+            <w:r>
+              <w:t xml:space="preserve">269</w:t>
             </w:r>
           </w:p>
         </w:tc>
@@ -7636,19 +7652,19 @@
               <w:jc w:val="left"/>
             </w:pPr>
             <w:r>
-              <w:t xml:space="preserve">85</w:t>
-            </w:r>
-          </w:p>
-        </w:tc>
-        <w:tc>
-          <w:tcPr/>
-          <w:p>
-            <w:pPr>
-              <w:pStyle w:val="Compact"/>
-              <w:jc w:val="left"/>
-            </w:pPr>
-            <w:r>
-              <w:t xml:space="preserve">265</w:t>
+              <w:t xml:space="preserve">88</w:t>
+            </w:r>
+          </w:p>
+        </w:tc>
+        <w:tc>
+          <w:tcPr/>
+          <w:p>
+            <w:pPr>
+              <w:pStyle w:val="Compact"/>
+              <w:jc w:val="left"/>
+            </w:pPr>
+            <w:r>
+              <w:t xml:space="preserve">269</w:t>
             </w:r>
           </w:p>
         </w:tc>
@@ -7674,19 +7690,19 @@
               <w:jc w:val="left"/>
             </w:pPr>
             <w:r>
-              <w:t xml:space="preserve">25</w:t>
-            </w:r>
-          </w:p>
-        </w:tc>
-        <w:tc>
-          <w:tcPr/>
-          <w:p>
-            <w:pPr>
-              <w:pStyle w:val="Compact"/>
-              <w:jc w:val="left"/>
-            </w:pPr>
-            <w:r>
-              <w:t xml:space="preserve">265</w:t>
+              <w:t xml:space="preserve">26</w:t>
+            </w:r>
+          </w:p>
+        </w:tc>
+        <w:tc>
+          <w:tcPr/>
+          <w:p>
+            <w:pPr>
+              <w:pStyle w:val="Compact"/>
+              <w:jc w:val="left"/>
+            </w:pPr>
+            <w:r>
+              <w:t xml:space="preserve">269</w:t>
             </w:r>
           </w:p>
         </w:tc>
@@ -7710,7 +7726,7 @@
         <w:pStyle w:val="Compact"/>
       </w:pPr>
       <w:r>
-        <w:t xml:space="preserve">Les 210 autres textes ne sont pas « faux ». Ils présentent un écart à examiner, n’ont pas encore été appariés, ou ne portent pas de numéro ICUR. Les en exclure introduit un</w:t>
+        <w:t xml:space="preserve">Les 206 autres textes ne sont pas « faux ». Ils présentent un écart à examiner, n’ont pas encore été appariés, ou ne portent pas de numéro ICUR. Les en exclure introduit un</w:t>
       </w:r>
       <w:r>
         <w:t xml:space="preserve"> </w:t>
@@ -9210,7 +9226,7 @@
               <w:jc w:val="left"/>
             </w:pPr>
             <w:r>
-              <w:t xml:space="preserve">v2.0 + lots 1-2</w:t>
+              <w:t xml:space="preserve">v2.0 + lots 1-3</w:t>
             </w:r>
           </w:p>
         </w:tc>
@@ -9282,7 +9298,7 @@
               <w:jc w:val="left"/>
             </w:pPr>
             <w:r>
-              <w:t xml:space="preserve">435 notices sur 478 confrontées à l’EDB ; aucune collation sur l’ICVR, aucune autopsie</w:t>
+              <w:t xml:space="preserve">440 notices sur 478 confrontées à l’EDB (listes entièrement parcourues ; 16 absentes de la liste publique, 22 sans n° ICUR) ; aucune collation sur l’ICVR, aucune autopsie</w:t>
             </w:r>
           </w:p>
         </w:tc>
@@ -10769,7 +10785,7 @@
     </w:p>
     <w:bookmarkEnd w:id="71"/>
     <w:bookmarkEnd w:id="72"/>
-    <w:bookmarkStart w:id="75" w:name="journal-des-modifications"/>
+    <w:bookmarkStart w:id="76" w:name="journal-des-modifications"/>
     <w:p>
       <w:pPr>
         <w:pStyle w:val="Heading1"/>
@@ -12470,7 +12486,375 @@
       </w:tr>
     </w:tbl>
     <w:bookmarkEnd w:id="74"/>
+    <w:bookmarkStart w:id="75" w:name="lot-3-reprise-automatique-0516-utc"/>
+    <w:p>
+      <w:pPr>
+        <w:pStyle w:val="Heading2"/>
+      </w:pPr>
+      <w:r>
+        <w:t xml:space="preserve">2026-10-14 — lot 3 (reprise automatique, 05:16 UTC)</w:t>
+      </w:r>
+    </w:p>
+    <w:tbl>
+      <w:tblPr>
+        <w:tblStyle w:val="Table"/>
+        <w:tblW w:type="pct" w:w="5000"/>
+        <w:tblLook w:firstRow="1" w:lastRow="0" w:firstColumn="0" w:lastColumn="0" w:noHBand="0" w:noVBand="0" w:val="0020"/>
+        <w:jc w:val="start"/>
+      </w:tblPr>
+      <w:tblGrid>
+        <w:gridCol w:w="1584"/>
+        <w:gridCol w:w="1584"/>
+        <w:gridCol w:w="1584"/>
+        <w:gridCol w:w="1584"/>
+        <w:gridCol w:w="1584"/>
+      </w:tblGrid>
+      <w:tr>
+        <w:trPr>
+          <w:tblHeader w:val="true"/>
+        </w:trPr>
+        <w:tc>
+          <w:tcPr/>
+          <w:p>
+            <w:pPr>
+              <w:pStyle w:val="Compact"/>
+              <w:jc w:val="left"/>
+            </w:pPr>
+            <w:r>
+              <w:t xml:space="preserve">#</w:t>
+            </w:r>
+          </w:p>
+        </w:tc>
+        <w:tc>
+          <w:tcPr/>
+          <w:p>
+            <w:pPr>
+              <w:pStyle w:val="Compact"/>
+              <w:jc w:val="left"/>
+            </w:pPr>
+            <w:r>
+              <w:t xml:space="preserve">Objet</w:t>
+            </w:r>
+          </w:p>
+        </w:tc>
+        <w:tc>
+          <w:tcPr/>
+          <w:p>
+            <w:pPr>
+              <w:pStyle w:val="Compact"/>
+              <w:jc w:val="left"/>
+            </w:pPr>
+            <w:r>
+              <w:t xml:space="preserve">Action</w:t>
+            </w:r>
+          </w:p>
+        </w:tc>
+        <w:tc>
+          <w:tcPr/>
+          <w:p>
+            <w:pPr>
+              <w:pStyle w:val="Compact"/>
+              <w:jc w:val="left"/>
+            </w:pPr>
+            <w:r>
+              <w:t xml:space="preserve">Fichier</w:t>
+            </w:r>
+          </w:p>
+        </w:tc>
+        <w:tc>
+          <w:tcPr/>
+          <w:p>
+            <w:pPr>
+              <w:pStyle w:val="Compact"/>
+              <w:jc w:val="left"/>
+            </w:pPr>
+            <w:r>
+              <w:t xml:space="preserve">Preuve</w:t>
+            </w:r>
+          </w:p>
+        </w:tc>
+      </w:tr>
+      <w:tr>
+        <w:tc>
+          <w:tcPr/>
+          <w:p>
+            <w:pPr>
+              <w:pStyle w:val="Compact"/>
+              <w:jc w:val="left"/>
+            </w:pPr>
+            <w:r>
+              <w:t xml:space="preserve">21</w:t>
+            </w:r>
+          </w:p>
+        </w:tc>
+        <w:tc>
+          <w:tcPr/>
+          <w:p>
+            <w:pPr>
+              <w:pStyle w:val="Compact"/>
+              <w:jc w:val="left"/>
+            </w:pPr>
+            <w:r>
+              <w:t xml:space="preserve">Collation EDCS/EDB</w:t>
+            </w:r>
+          </w:p>
+        </w:tc>
+        <w:tc>
+          <w:tcPr/>
+          <w:p>
+            <w:pPr>
+              <w:pStyle w:val="Compact"/>
+              <w:jc w:val="left"/>
+            </w:pPr>
+            <w:r>
+              <w:t xml:space="preserve">parcours des listes EDB terminé pour les 462 n° ICUR du corpus : 440 notices appariées (269 concordantes, 134 à examiner, 37 divergentes)</w:t>
+            </w:r>
+          </w:p>
+        </w:tc>
+        <w:tc>
+          <w:tcPr/>
+          <w:p>
+            <w:pPr>
+              <w:pStyle w:val="Compact"/>
+              <w:jc w:val="left"/>
+            </w:pPr>
+            <w:r>
+              <w:rPr>
+                <w:rStyle w:val="VerbatimChar"/>
+              </w:rPr>
+              <w:t xml:space="preserve">02_verifications/collation_edcs_edb.csv</w:t>
+            </w:r>
+          </w:p>
+        </w:tc>
+        <w:tc>
+          <w:tcPr/>
+          <w:p>
+            <w:pPr>
+              <w:pStyle w:val="Compact"/>
+              <w:jc w:val="left"/>
+            </w:pPr>
+            <w:r>
+              <w:rPr>
+                <w:rStyle w:val="VerbatimChar"/>
+              </w:rPr>
+              <w:t xml:space="preserve">edb/brut/*.json</w:t>
+            </w:r>
+            <w:r>
+              <w:t xml:space="preserve"> </w:t>
+            </w:r>
+            <w:r>
+              <w:t xml:space="preserve">;</w:t>
+            </w:r>
+            <w:r>
+              <w:t xml:space="preserve"> </w:t>
+            </w:r>
+            <w:r>
+              <w:rPr>
+                <w:rStyle w:val="VerbatimChar"/>
+              </w:rPr>
+              <w:t xml:space="preserve">edb/manual_rows.csv</w:t>
+            </w:r>
+          </w:p>
+        </w:tc>
+      </w:tr>
+      <w:tr>
+        <w:tc>
+          <w:tcPr/>
+          <w:p>
+            <w:pPr>
+              <w:pStyle w:val="Compact"/>
+              <w:jc w:val="left"/>
+            </w:pPr>
+            <w:r>
+              <w:t xml:space="preserve">22</w:t>
+            </w:r>
+          </w:p>
+        </w:tc>
+        <w:tc>
+          <w:tcPr/>
+          <w:p>
+            <w:pPr>
+              <w:pStyle w:val="Compact"/>
+              <w:jc w:val="left"/>
+            </w:pPr>
+            <w:r>
+              <w:t xml:space="preserve">16 n° ICUR II (4798–4836, 4948, 5711–5712)</w:t>
+            </w:r>
+          </w:p>
+        </w:tc>
+        <w:tc>
+          <w:tcPr/>
+          <w:p>
+            <w:pPr>
+              <w:pStyle w:val="Compact"/>
+              <w:jc w:val="left"/>
+            </w:pPr>
+            <w:r>
+              <w:t xml:space="preserve">absents de la liste publique EDB ; recherche par texte infructueuse ; cause non établie</w:t>
+            </w:r>
+          </w:p>
+        </w:tc>
+        <w:tc>
+          <w:tcPr/>
+          <w:p>
+            <w:pPr>
+              <w:pStyle w:val="Compact"/>
+              <w:jc w:val="left"/>
+            </w:pPr>
+            <w:r>
+              <w:rPr>
+                <w:rStyle w:val="VerbatimChar"/>
+              </w:rPr>
+              <w:t xml:space="preserve">ETAT_COLLATION.md</w:t>
+            </w:r>
+          </w:p>
+        </w:tc>
+        <w:tc>
+          <w:tcPr/>
+          <w:p>
+            <w:pPr>
+              <w:pStyle w:val="Compact"/>
+              <w:jc w:val="left"/>
+            </w:pPr>
+            <w:r>
+              <w:t xml:space="preserve">registre</w:t>
+            </w:r>
+          </w:p>
+        </w:tc>
+      </w:tr>
+      <w:tr>
+        <w:tc>
+          <w:tcPr/>
+          <w:p>
+            <w:pPr>
+              <w:pStyle w:val="Compact"/>
+              <w:jc w:val="left"/>
+            </w:pPr>
+            <w:r>
+              <w:t xml:space="preserve">23</w:t>
+            </w:r>
+          </w:p>
+        </w:tc>
+        <w:tc>
+          <w:tcPr/>
+          <w:p>
+            <w:pPr>
+              <w:pStyle w:val="Compact"/>
+              <w:jc w:val="left"/>
+            </w:pPr>
+            <w:r>
+              <w:t xml:space="preserve">Signes chrétiens</w:t>
+            </w:r>
+          </w:p>
+        </w:tc>
+        <w:tc>
+          <w:tcPr/>
+          <w:p>
+            <w:pPr>
+              <w:pStyle w:val="Compact"/>
+              <w:jc w:val="left"/>
+            </w:pPr>
+            <w:r>
+              <w:t xml:space="preserve">46 chrismes ou croix sur 440 notices (10,5 %)</w:t>
+            </w:r>
+          </w:p>
+        </w:tc>
+        <w:tc>
+          <w:tcPr/>
+          <w:p>
+            <w:pPr>
+              <w:pStyle w:val="Compact"/>
+              <w:jc w:val="left"/>
+            </w:pPr>
+            <w:r>
+              <w:t xml:space="preserve">dossiers § E</w:t>
+            </w:r>
+          </w:p>
+        </w:tc>
+        <w:tc>
+          <w:tcPr/>
+          <w:p>
+            <w:pPr>
+              <w:pStyle w:val="Compact"/>
+              <w:jc w:val="left"/>
+            </w:pPr>
+            <w:r>
+              <w:rPr>
+                <w:rStyle w:val="VerbatimChar"/>
+              </w:rPr>
+              <w:t xml:space="preserve">collation_edcs_edb.csv</w:t>
+            </w:r>
+          </w:p>
+        </w:tc>
+      </w:tr>
+      <w:tr>
+        <w:tc>
+          <w:tcPr/>
+          <w:p>
+            <w:pPr>
+              <w:pStyle w:val="Compact"/>
+              <w:jc w:val="left"/>
+            </w:pPr>
+            <w:r>
+              <w:t xml:space="preserve">24</w:t>
+            </w:r>
+          </w:p>
+        </w:tc>
+        <w:tc>
+          <w:tcPr/>
+          <w:p>
+            <w:pPr>
+              <w:pStyle w:val="Compact"/>
+              <w:jc w:val="left"/>
+            </w:pPr>
+            <w:r>
+              <w:t xml:space="preserve">Statistiques stabilisées</w:t>
+            </w:r>
+          </w:p>
+        </w:tc>
+        <w:tc>
+          <w:tcPr/>
+          <w:p>
+            <w:pPr>
+              <w:pStyle w:val="Compact"/>
+              <w:jc w:val="left"/>
+            </w:pPr>
+            <w:r>
+              <w:t xml:space="preserve">recalcul : 269 lectures stabilisées</w:t>
+            </w:r>
+          </w:p>
+        </w:tc>
+        <w:tc>
+          <w:tcPr/>
+          <w:p>
+            <w:pPr>
+              <w:pStyle w:val="Compact"/>
+              <w:jc w:val="left"/>
+            </w:pPr>
+            <w:r>
+              <w:rPr>
+                <w:rStyle w:val="VerbatimChar"/>
+              </w:rPr>
+              <w:t xml:space="preserve">STATISTIQUES_STABILISEES.md</w:t>
+            </w:r>
+          </w:p>
+        </w:tc>
+        <w:tc>
+          <w:tcPr/>
+          <w:p>
+            <w:pPr>
+              <w:pStyle w:val="Compact"/>
+              <w:jc w:val="left"/>
+            </w:pPr>
+            <w:r>
+              <w:t xml:space="preserve">script</w:t>
+            </w:r>
+          </w:p>
+        </w:tc>
+      </w:tr>
+    </w:tbl>
     <w:bookmarkEnd w:id="75"/>
+    <w:bookmarkEnd w:id="76"/>
     <w:sectPr/>
   </w:body>
 </w:document>

</xml_diff>